<commit_message>
Expand and refine Euclid DR1 satellite project
</commit_message>
<xml_diff>
--- a/01_Euclid_DR1_Dwarf_Satellites_and_Streams.docx
+++ b/01_Euclid_DR1_Dwarf_Satellites_and_Streams.docx
@@ -13,7 +13,7 @@
         <w:rPr>
           <w:rFonts w:ascii="Arial" w:hAnsi="Arial" w:cs="Arial"/>
         </w:rPr>
-        <w:t>Project Title: Ghosts in the Wide Survey: Discovering Milky Way Satellites and Stellar Streams with Euclid DR1</w:t>
+        <w:t>Project Title: Discovering New Ultra-Faint Milky Way Satellites with Euclid DR1</w:t>
       </w:r>
     </w:p>
     <w:p>
@@ -73,25 +73,25 @@
           <w:sz w:val="22"/>
           <w:szCs w:val="22"/>
         </w:rPr>
-        <w:t>The faintest companions of the Milky Way are invisible in integrated light. They reveal themselves as spatially coherent groups of individually resolved stars that follow the colour–magnitude diagram of an old, metal-poor population. Compact groups may be ultra-faint dwarf galaxies or star clusters; long, thin groups may be streams left by systems that the Galaxy has torn apart. Both probe low-mass galaxy formation, the Milky Way potential, and dark matter.</w:t>
-      </w:r>
-    </w:p>
-    <w:p>
-      <w:pPr>
-        <w:spacing w:before="40" w:after="0" w:line="360" w:lineRule="auto"/>
-        <w:rPr>
-          <w:rFonts w:ascii="Arial" w:hAnsi="Arial" w:cs="Arial"/>
-          <w:sz w:val="22"/>
-          <w:szCs w:val="22"/>
-        </w:rPr>
-      </w:pPr>
-      <w:r>
-        <w:rPr>
-          <w:rFonts w:ascii="Arial" w:hAnsi="Arial" w:cs="Arial"/>
-          <w:sz w:val="22"/>
-          <w:szCs w:val="22"/>
-        </w:rPr>
-        <w:t>This project will adapt the classical resolved-star search developed by Koposov et al. and Torrealba et al. to Euclid DR1. At each trial distance, the student will map stars that follow an old, metal-poor colour–magnitude sequence and filter the map over several angular scales to reveal compact overdensities. The same catalogues will also be searched for elongated structure. Euclid's sharp imaging will be combined with public optical photometry, and Gaia astrometry will help validate brighter stars. Known systems and injected mock populations will calibrate completeness and false positives before the blind search. The primary goal is a new discovery; independently recovering and characterising a newly announced or marginal feature would also make a successful project.</w:t>
+        <w:t>The faintest companions of the Milky Way are invisible in integrated light. They appear only as sparse groups of resolved stars that trace an old, metal-poor population. Ultra-faint dwarf galaxies (UFDs) inhabit the smallest dark-matter haloes known to host stars, so their census tests low-mass galaxy formation, reionisation, and the small-scale behaviour of dark matter. That census remains incomplete, especially for distant or diffuse systems.</w:t>
+      </w:r>
+    </w:p>
+    <w:p>
+      <w:pPr>
+        <w:spacing w:before="40" w:after="0" w:line="360" w:lineRule="auto"/>
+        <w:rPr>
+          <w:rFonts w:ascii="Arial" w:hAnsi="Arial" w:cs="Arial"/>
+          <w:sz w:val="22"/>
+          <w:szCs w:val="22"/>
+        </w:rPr>
+      </w:pPr>
+      <w:r>
+        <w:rPr>
+          <w:rFonts w:ascii="Arial" w:hAnsi="Arial" w:cs="Arial"/>
+          <w:sz w:val="22"/>
+          <w:szCs w:val="22"/>
+        </w:rPr>
+        <w:t>Euclid DR1 will combine deep photometry, sharp imaging, and wide sky coverage. The student's main aim is to discover and characterise new UFD candidates. Old, metal-poor isochrones placed at a range of distances will select possible members; a difference-of-Gaussians filter will then reveal spatial overdensities. Every credible peak will be ranked using its colour-magnitude diagram, spatial concentration, stability under changes to the selection, Gaia astrometry for brighter stars, and checks for galaxy clustering or imaging artefacts. Known systems and injected mock satellites will measure the search sensitivity. The strongest candidates will receive initial estimates of distance, luminosity, size, ellipticity, and membership. Stellar streams provide a secondary extension.</w:t>
       </w:r>
     </w:p>
     <w:p>
@@ -123,43 +123,43 @@
           <w:sz w:val="22"/>
           <w:szCs w:val="22"/>
         </w:rPr>
-        <w:t>Ultra-faint dwarf galaxies occupy the least massive dark-matter haloes known to host stars. Their abundance, stellar populations, and spatial distribution constrain reionisation and the small-scale behaviour of dark matter. Stellar streams preserve a complementary record: they reveal past accretion, trace the Galactic potential, and record gravitational perturbations. In both cases, the signal is a small excess of stars embedded in a much larger foreground of Milky Way stars and unresolved galaxies.</w:t>
-      </w:r>
-    </w:p>
-    <w:p>
-      <w:pPr>
-        <w:spacing w:before="40" w:after="0" w:line="360" w:lineRule="auto"/>
-        <w:rPr>
-          <w:rFonts w:ascii="Arial" w:hAnsi="Arial" w:cs="Arial"/>
-          <w:sz w:val="22"/>
-          <w:szCs w:val="22"/>
-        </w:rPr>
-      </w:pPr>
-      <w:r>
-        <w:rPr>
-          <w:rFonts w:ascii="Arial" w:hAnsi="Arial" w:cs="Arial"/>
-          <w:sz w:val="22"/>
-          <w:szCs w:val="22"/>
-        </w:rPr>
-        <w:t>Koposov et al. (2008, 2015) and Torrealba et al. (2016, 2018, 2019) established the classical workflow. At each trial distance, an old, metal-poor main-sequence/red-giant-branch isochrone mask—and, where useful, a separate blue-horizontal-branch mask—selects candidate members. Narrow and broad Gaussian kernels then compare the density of a possible source with its local foreground. Repeating the scan over distance and angular scale yields a ranked peak list. A coherent colour–magnitude sequence and spatial excess, together with checks against completeness, extinction, bright-star masks, tile boundaries, and galaxy contamination, are required before any peak becomes a stellar-system candidate.</w:t>
-      </w:r>
-    </w:p>
-    <w:p>
-      <w:pPr>
-        <w:spacing w:before="40" w:after="0" w:line="360" w:lineRule="auto"/>
-        <w:rPr>
-          <w:rFonts w:ascii="Arial" w:hAnsi="Arial" w:cs="Arial"/>
-          <w:sz w:val="22"/>
-          <w:szCs w:val="22"/>
-        </w:rPr>
-      </w:pPr>
-      <w:r>
-        <w:rPr>
-          <w:rFonts w:ascii="Arial" w:hAnsi="Arial" w:cs="Arial"/>
-          <w:sz w:val="22"/>
-          <w:szCs w:val="22"/>
-        </w:rPr>
-        <w:t>Euclid brings exceptionally sharp VIS imaging over a large area, enabling point-source selection at magnitudes where Gaia is incomplete. Its single broad optical band and shallower near-infrared bands do not, however, replace a conventional multi-band optical survey for the faintest colour–magnitude work. The project will therefore use Euclid morphology and photometry together with the best available ground-based colours in each field. The staged DR1 release also makes scope control essential: public Q1 or precursor fields will support calibration and code development, and the blind search will begin only after the usable DR1 footprint and catalogue characteristics are known.</w:t>
+        <w:t>UFDs extend the galaxy population to its lowest luminosities. Their ancient stellar populations and large inferred mass-to-light ratios make them sensitive probes of star formation in low-mass dark-matter haloes. A more complete census can test how reionisation suppressed early galaxies and whether the abundance of small haloes agrees with dark-matter models. Yet a UFD may contribute only a few detectable stars above a foreground of Milky Way stars and compact background galaxies. A plausible overdensity may instead be a star cluster, a chance alignment, or a survey artefact. The search must therefore identify weak signals without forcing every detection into a physical class. Spectroscopy may ultimately be needed to distinguish a dark-matter-dominated dwarf from an ultra-faint star cluster.</w:t>
+      </w:r>
+    </w:p>
+    <w:p>
+      <w:pPr>
+        <w:spacing w:before="40" w:after="0" w:line="360" w:lineRule="auto"/>
+        <w:rPr>
+          <w:rFonts w:ascii="Arial" w:hAnsi="Arial" w:cs="Arial"/>
+          <w:sz w:val="22"/>
+          <w:szCs w:val="22"/>
+        </w:rPr>
+      </w:pPr>
+      <w:r>
+        <w:rPr>
+          <w:rFonts w:ascii="Arial" w:hAnsi="Arial" w:cs="Arial"/>
+          <w:sz w:val="22"/>
+          <w:szCs w:val="22"/>
+        </w:rPr>
+        <w:t>Resolved-star surveys turned this problem into a repeatable experiment. Koposov et al. (2008, 2015) used colour-magnitude selections and spatial filtering to uncover systems missed in integrated light, while Torrealba et al. (2016a, 2016b) extended the method across a broad range of sizes and surface brightnesses. Drlica-Wagner et al. (2020) used injected systems to measure the selection function of a survey-scale census. Cerny et al. (2021, 2023) combined matched-filter searches with structural modelling and Gaia proper motions, while retaining the dwarf-cluster ambiguity when the evidence remained inconclusive.</w:t>
+      </w:r>
+    </w:p>
+    <w:p>
+      <w:pPr>
+        <w:spacing w:before="40" w:after="0" w:line="360" w:lineRule="auto"/>
+        <w:rPr>
+          <w:rFonts w:ascii="Arial" w:hAnsi="Arial" w:cs="Arial"/>
+          <w:sz w:val="22"/>
+          <w:szCs w:val="22"/>
+        </w:rPr>
+      </w:pPr>
+      <w:r>
+        <w:rPr>
+          <w:rFonts w:ascii="Arial" w:hAnsi="Arial" w:cs="Arial"/>
+          <w:sz w:val="22"/>
+          <w:szCs w:val="22"/>
+        </w:rPr>
+        <w:t>Euclid changes the reach of this experiment. Its sharp VIS images help separate stars from barely resolved galaxies, while its optical and near-infrared photometry reaches far fainter than Gaia over a wide area. Euclid DR1 will therefore drive the discovery search; shallower external imaging will neither set its depth nor be required across the footprint. Gaia will enter only for bright possible members. This choice makes variable depth, bright-star masks, catalogue artefacts, and residual galaxy contamination essential controls. A transparent search whose assumptions can be tested field by field is more useful here than a highly tuned algorithm.</w:t>
       </w:r>
     </w:p>
     <w:p>
@@ -191,7 +191,7 @@
           <w:sz w:val="22"/>
           <w:szCs w:val="22"/>
         </w:rPr>
-        <w:t>The work is organised as an end-to-end detection experiment. The student will first establish where a reliable search is possible, then validate the machinery before examining unknown regions. Compact satellites and streams share the first three stages; after the pilot analysis, one branch will become the main target for a publication-quality analysis and the other will remain an extension.</w:t>
+        <w:t>The student will build a simple pipeline, validate it on known and artificial systems, and then search the Euclid DR1 footprint:</w:t>
       </w:r>
     </w:p>
     <w:p>
@@ -217,15 +217,15 @@
           <w:b/>
           <w:bCs/>
         </w:rPr>
-        <w:t xml:space="preserve">Define the search footprint. </w:t>
-      </w:r>
-      <w:r>
-        <w:rPr>
-          <w:rFonts w:ascii="Arial" w:hAnsi="Arial" w:cs="Arial"/>
-          <w:sz w:val="22"/>
-          <w:szCs w:val="22"/>
-        </w:rPr>
-        <w:t>Inspect the released DR1 products, masks and depth maps, and select one contiguous, well-behaved region as the core area. Learn the catalogue schema on Q1 or other public Euclid fields, then identify the best overlapping optical survey. The student will make a reproducible sky mask that excludes tile edges, bright-star haloes, high-extinction regions and missing-band coverage.</w:t>
+        <w:t>Prepare the Euclid DR1 sample.</w:t>
+      </w:r>
+      <w:r>
+        <w:rPr>
+          <w:rFonts w:ascii="Arial" w:hAnsi="Arial" w:cs="Arial"/>
+          <w:sz w:val="22"/>
+          <w:szCs w:val="22"/>
+        </w:rPr>
+        <w:t xml:space="preserve"> Use release masks and depth information to define a well-behaved footprint and a conservative point-source sample. Measure how completeness and unresolved-galaxy contamination vary across the footprint. Begin with simple catalogue cuts and refine them only when validation tests reveal a clear need.</w:t>
       </w:r>
     </w:p>
     <w:p>
@@ -251,15 +251,15 @@
           <w:b/>
           <w:bCs/>
         </w:rPr>
-        <w:t xml:space="preserve">Build a trustworthy stellar catalogue. </w:t>
-      </w:r>
-      <w:r>
-        <w:rPr>
-          <w:rFonts w:ascii="Arial" w:hAnsi="Arial" w:cs="Arial"/>
-          <w:sz w:val="22"/>
-          <w:szCs w:val="22"/>
-        </w:rPr>
-        <w:t>Calibrate Euclid point-source diagnostics against bright Gaia stars and deep external fields. Measure how completeness and unresolved-galaxy contamination vary with position, magnitude and colour. Cross-match only where it adds information, preserving Euclid-only detections at the faint end, and define a magnitude range in which the selection function can be defended.</w:t>
+        <w:t>Search for resolved stellar systems.</w:t>
+      </w:r>
+      <w:r>
+        <w:rPr>
+          <w:rFonts w:ascii="Arial" w:hAnsi="Arial" w:cs="Arial"/>
+          <w:sz w:val="22"/>
+          <w:szCs w:val="22"/>
+        </w:rPr>
+        <w:t xml:space="preserve"> Shift old, metal-poor isochrones over a grid of distances and select Euclid sources close to each sequence. Apply narrow and broad Gaussian smoothing to the resulting density maps; their difference suppresses the slowly varying foreground and highlights compact overdensities over a modest range of angular scales.</w:t>
       </w:r>
     </w:p>
     <w:p>
@@ -285,15 +285,15 @@
           <w:b/>
           <w:bCs/>
         </w:rPr>
-        <w:t xml:space="preserve">Construct isochrone-filtered maps. </w:t>
-      </w:r>
-      <w:r>
-        <w:rPr>
-          <w:rFonts w:ascii="Arial" w:hAnsi="Arial" w:cs="Arial"/>
-          <w:sz w:val="22"/>
-          <w:szCs w:val="22"/>
-        </w:rPr>
-        <w:t>Apply old, metal-poor main-sequence/red-giant-branch isochrone masks and separate blue-horizontal-branch ridgeline masks over a grid of distance moduli. Bin the selected stars on the sky and convolve each map with narrow and broad Gaussian kernels over a grid of compact angular scales. Recover known systems and inject mock dwarfs before inspecting blind peaks; these tests will set detection thresholds and the compact-system selection function. The stream branch will use the same colour–magnitude-selected catalogues with elongated filters.</w:t>
+        <w:t>Calibrate the search sensitivity.</w:t>
+      </w:r>
+      <w:r>
+        <w:rPr>
+          <w:rFonts w:ascii="Arial" w:hAnsi="Arial" w:cs="Arial"/>
+          <w:sz w:val="22"/>
+          <w:szCs w:val="22"/>
+        </w:rPr>
+        <w:t xml:space="preserve"> Recover known satellites and inject mock UFDs spanning distance, luminosity, size, and ellipticity. Run the same search on the mocks to measure recovery probability and completeness. Use off-isochrone selections or position-scrambled catalogues to gauge spurious peaks. Together, these tests will set detection thresholds and make non-detections interpretable without displacing the discovery search itself.</w:t>
       </w:r>
     </w:p>
     <w:p>
@@ -319,15 +319,15 @@
           <w:b/>
           <w:bCs/>
         </w:rPr>
-        <w:t xml:space="preserve">Search for compact systems. </w:t>
-      </w:r>
-      <w:r>
-        <w:rPr>
-          <w:rFonts w:ascii="Arial" w:hAnsi="Arial" w:cs="Arial"/>
-          <w:sz w:val="22"/>
-          <w:szCs w:val="22"/>
-        </w:rPr>
-        <w:t>Identify overdensities over a controlled range of sizes and account for the large number of sky positions, distance slices, and kernels examined. Candidate validation will combine evidence from the colour–magnitude diagram, spatial morphology, extinction maps, image cutouts, catalogue flags, and Gaia proper motions for the brighter subset. A spatial-plus-colour–magnitude mixture model will estimate membership probabilities and basic structural parameters.</w:t>
+        <w:t>Vet and rank every credible peak.</w:t>
+      </w:r>
+      <w:r>
+        <w:rPr>
+          <w:rFonts w:ascii="Arial" w:hAnsi="Arial" w:cs="Arial"/>
+          <w:sz w:val="22"/>
+          <w:szCs w:val="22"/>
+        </w:rPr>
+        <w:t xml:space="preserve"> Inspect the colour-magnitude diagram, spatial concentration, and persistence under modest changes to the isochrone selection. Use Gaia proper motions and parallaxes for brighter possible members. Compare stellar and galaxy density maps: a corresponding galaxy excess may identify an unresolved-galaxy group rather than a Milky Way system. Image cutouts, masks, depth, and catalogue flags will expose further artefacts.</w:t>
       </w:r>
     </w:p>
     <w:p>
@@ -353,15 +353,15 @@
           <w:b/>
           <w:bCs/>
         </w:rPr>
-        <w:t xml:space="preserve">Search for linear structure. </w:t>
-      </w:r>
-      <w:r>
-        <w:rPr>
-          <w:rFonts w:ascii="Arial" w:hAnsi="Arial" w:cs="Arial"/>
-          <w:sz w:val="22"/>
-          <w:szCs w:val="22"/>
-        </w:rPr>
-        <w:t>Apply ridge, great-circle or Hough-style methods to the same masked maps, with thresholds calibrated on scrambled catalogues and injected streams. For the most credible feature, fit a track, width, density variation and, if supported by the data, a distance gradient. Tests with alternative filters and masks will be required to rule out survey seams and diffuse foreground residuals.</w:t>
+        <w:t>Characterise the strongest candidates.</w:t>
+      </w:r>
+      <w:r>
+        <w:rPr>
+          <w:rFonts w:ascii="Arial" w:hAnsi="Arial" w:cs="Arial"/>
+          <w:sz w:val="22"/>
+          <w:szCs w:val="22"/>
+        </w:rPr>
+        <w:t xml:space="preserve"> Fit spatial and colour-magnitude models to estimate membership probabilities, distance, half-light radius, ellipticity, and total luminosity. Compare these measurements with known dwarfs and clusters, and retain candidate status where the data do not determine the system's nature. Produce a prioritised list for deeper imaging or spectroscopy.</w:t>
       </w:r>
     </w:p>
     <w:p>
@@ -387,33 +387,33 @@
           <w:b/>
           <w:bCs/>
         </w:rPr>
-        <w:t xml:space="preserve">Measure sensitivity and characterise the best target. </w:t>
-      </w:r>
-      <w:r>
-        <w:rPr>
-          <w:rFonts w:ascii="Arial" w:hAnsi="Arial" w:cs="Arial"/>
-          <w:sz w:val="22"/>
-          <w:szCs w:val="22"/>
-        </w:rPr>
-        <w:t>Inject populations spanning luminosity, size, distance, ellipticity, width, and sky background, and run the complete pipeline without manual intervention. The final result will include a recovery function and a ranked, documented candidate list. The strongest candidate will receive a detailed analysis; if no new candidate survives, the analysis will focus on a recently published object or a pre-selected validation target.</w:t>
-      </w:r>
-    </w:p>
-    <w:p>
-      <w:pPr>
-        <w:spacing w:before="40" w:after="0" w:line="360" w:lineRule="auto"/>
-        <w:rPr>
-          <w:rFonts w:ascii="Arial" w:hAnsi="Arial" w:cs="Arial"/>
-          <w:sz w:val="22"/>
-          <w:szCs w:val="22"/>
-        </w:rPr>
-      </w:pPr>
-      <w:r>
-        <w:rPr>
-          <w:rFonts w:ascii="Arial" w:hAnsi="Arial" w:cs="Arial"/>
-          <w:sz w:val="22"/>
-          <w:szCs w:val="22"/>
-        </w:rPr>
-        <w:t>The core project is complete once it has produced a validated search atlas and quantified the structures that the search could detect. If another team announces the strongest discoveries first, the student will independently recover and model one object, compare Euclid with DES or DELVE in the overlap, or study extra-tidal structure around a known satellite or cluster. Stretch goals include a joint proper-motion likelihood, a spectroscopic follow-up target list, and expansion to the full usable DR1 footprint.</w:t>
+        <w:t>Extension: search for streams.</w:t>
+      </w:r>
+      <w:r>
+        <w:rPr>
+          <w:rFonts w:ascii="Arial" w:hAnsi="Arial" w:cs="Arial"/>
+          <w:sz w:val="22"/>
+          <w:szCs w:val="22"/>
+        </w:rPr>
+        <w:t xml:space="preserve"> If the core UFD search is complete, use the same isochrone-selected maps to look for elongated, low-contrast features. This extension reuses the validated catalogue and masks rather than creating a parallel stream-search programme.</w:t>
+      </w:r>
+    </w:p>
+    <w:p>
+      <w:pPr>
+        <w:spacing w:before="40" w:after="0" w:line="360" w:lineRule="auto"/>
+        <w:rPr>
+          <w:rFonts w:ascii="Arial" w:hAnsi="Arial" w:cs="Arial"/>
+          <w:sz w:val="22"/>
+          <w:szCs w:val="22"/>
+        </w:rPr>
+      </w:pPr>
+      <w:r>
+        <w:rPr>
+          <w:rFonts w:ascii="Arial" w:hAnsi="Arial" w:cs="Arial"/>
+          <w:sz w:val="22"/>
+          <w:szCs w:val="22"/>
+        </w:rPr>
+        <w:t>The main deliverable will be a ranked catalogue of all credible UFD candidates, initial measurements for the strongest systems, and a quantified search sensitivity across the usable Euclid DR1 footprint.</w:t>
       </w:r>
     </w:p>
     <w:p>
@@ -445,7 +445,7 @@
           <w:sz w:val="22"/>
           <w:szCs w:val="22"/>
         </w:rPr>
-        <w:t>The student should be comfortable with scientific Python, arrays, plotting and basic probability. Familiarity with stellar colour–magnitude diagrams or survey catalogues would be helpful but is not required. The most important habits are careful validation and a willingness to investigate selection effects; no prior machine-learning experience is expected.</w:t>
+        <w:t>The student should be comfortable with scientific Python, arrays, plotting, and basic probability. Familiarity with colour-magnitude diagrams or astronomical catalogues would help but is not required.</w:t>
       </w:r>
     </w:p>
     <w:p>
@@ -483,7 +483,7 @@
           <w:sz w:val="22"/>
           <w:szCs w:val="22"/>
         </w:rPr>
-        <w:t>Querying large astronomical catalogues with SQL/ADQL and working with sky coordinates in Astropy.</w:t>
+        <w:t>Querying astronomical catalogues with SQL/ADQL and working with sky coordinates in Astropy.</w:t>
       </w:r>
     </w:p>
     <w:p>
@@ -507,7 +507,7 @@
           <w:sz w:val="22"/>
           <w:szCs w:val="22"/>
         </w:rPr>
-        <w:t>Isochrone-based colour–magnitude filtering and probabilistic membership inference.</w:t>
+        <w:t>Isochrone-based colour-magnitude filtering and probabilistic membership inference.</w:t>
       </w:r>
     </w:p>
     <w:p>
@@ -531,7 +531,7 @@
           <w:sz w:val="22"/>
           <w:szCs w:val="22"/>
         </w:rPr>
-        <w:t>Spatial density estimation, image filtering and statistically controlled candidate searches.</w:t>
+        <w:t>Spatial density estimation, image filtering, and statistically controlled candidate searches.</w:t>
       </w:r>
     </w:p>
     <w:p>
@@ -555,7 +555,7 @@
           <w:sz w:val="22"/>
           <w:szCs w:val="22"/>
         </w:rPr>
-        <w:t>Injection–recovery experiments, false-discovery control and survey selection functions.</w:t>
+        <w:t>Injection-recovery experiments and measurement of survey selection functions.</w:t>
       </w:r>
     </w:p>
     <w:p>
@@ -649,8 +649,20 @@
           <w:sz w:val="22"/>
           <w:szCs w:val="22"/>
         </w:rPr>
-        <w:t>Koposov, S. et al. (2008), ‘The Luminosity Function of the Milky Way Satellites’, ApJ, 686, 279. https://doi.org/10.1086/589911</w:t>
-      </w:r>
+        <w:t xml:space="preserve">Koposov, S. et al. (2008), 'The Luminosity Function of the Milky Way Satellites', ApJ, 686, 279. </w:t>
+      </w:r>
+      <w:hyperlink r:id="rId10">
+        <w:r>
+          <w:rPr>
+            <w:rFonts w:ascii="Arial" w:hAnsi="Arial" w:cs="Arial"/>
+            <w:sz w:val="22"/>
+            <w:szCs w:val="22"/>
+            <w:color w:val="0563C1"/>
+            <w:u w:val="single"/>
+          </w:rPr>
+          <w:t>https://doi.org/10.1086/589911</w:t>
+        </w:r>
+      </w:hyperlink>
     </w:p>
     <w:p>
       <w:pPr>
@@ -673,8 +685,20 @@
           <w:sz w:val="22"/>
           <w:szCs w:val="22"/>
         </w:rPr>
-        <w:t>Koposov, S. E., Belokurov, V., Torrealba, G. &amp; Evans, N. W. (2015), ‘Beasts of the Southern Wild: Discovery of nine ultra-faint satellites in the vicinity of the Magellanic Clouds’, ApJ, 805, 130. https://doi.org/10.1088/0004-637X/805/2/130</w:t>
-      </w:r>
+        <w:t xml:space="preserve">Koposov, S. E., Belokurov, V., Torrealba, G. &amp; Evans, N. W. (2015), 'Beasts of the Southern Wild: Discovery of nine ultra-faint satellites in the vicinity of the Magellanic Clouds', ApJ, 805, 130. </w:t>
+      </w:r>
+      <w:hyperlink r:id="rId11">
+        <w:r>
+          <w:rPr>
+            <w:rFonts w:ascii="Arial" w:hAnsi="Arial" w:cs="Arial"/>
+            <w:sz w:val="22"/>
+            <w:szCs w:val="22"/>
+            <w:color w:val="0563C1"/>
+            <w:u w:val="single"/>
+          </w:rPr>
+          <w:t>https://doi.org/10.1088/0004-637X/805/2/130</w:t>
+        </w:r>
+      </w:hyperlink>
     </w:p>
     <w:p>
       <w:pPr>
@@ -697,8 +721,20 @@
           <w:sz w:val="22"/>
           <w:szCs w:val="22"/>
         </w:rPr>
-        <w:t>Torrealba, G., Koposov, S. E., Belokurov, V. &amp; Irwin, M. (2016), ‘The Feeble Giant. Discovery of a large and diffuse Milky Way dwarf galaxy in the constellation of Crater’, MNRAS, 459, 2370. https://doi.org/10.1093/mnras/stw733</w:t>
-      </w:r>
+        <w:t xml:space="preserve">Torrealba, G., Koposov, S. E., Belokurov, V. &amp; Irwin, M. (2016a), 'The Feeble Giant: Discovery of a large and diffuse Milky Way dwarf galaxy in the constellation of Crater', MNRAS, 459, 2370. </w:t>
+      </w:r>
+      <w:hyperlink r:id="rId12">
+        <w:r>
+          <w:rPr>
+            <w:rFonts w:ascii="Arial" w:hAnsi="Arial" w:cs="Arial"/>
+            <w:sz w:val="22"/>
+            <w:szCs w:val="22"/>
+            <w:color w:val="0563C1"/>
+            <w:u w:val="single"/>
+          </w:rPr>
+          <w:t>https://doi.org/10.1093/mnras/stw733</w:t>
+        </w:r>
+      </w:hyperlink>
     </w:p>
     <w:p>
       <w:pPr>
@@ -721,8 +757,20 @@
           <w:sz w:val="22"/>
           <w:szCs w:val="22"/>
         </w:rPr>
-        <w:t>Torrealba, G., Koposov, S. E., Belokurov, V. &amp; Irwin, M. (2016), ‘At the survey limits: discovery of the Aquarius 2 dwarf galaxy in the VST ATLAS and the SDSS data’, MNRAS, 463, 712. https://doi.org/10.1093/mnras/stw2051</w:t>
-      </w:r>
+        <w:t xml:space="preserve">Torrealba, G., Koposov, S. E., Belokurov, V. &amp; Irwin, M. (2016b), 'At the survey limits: discovery of the Aquarius 2 dwarf galaxy in the VST ATLAS and the SDSS data', MNRAS, 463, 712. </w:t>
+      </w:r>
+      <w:hyperlink r:id="rId13">
+        <w:r>
+          <w:rPr>
+            <w:rFonts w:ascii="Arial" w:hAnsi="Arial" w:cs="Arial"/>
+            <w:sz w:val="22"/>
+            <w:szCs w:val="22"/>
+            <w:color w:val="0563C1"/>
+            <w:u w:val="single"/>
+          </w:rPr>
+          <w:t>https://doi.org/10.1093/mnras/stw2051</w:t>
+        </w:r>
+      </w:hyperlink>
     </w:p>
     <w:p>
       <w:pPr>
@@ -745,8 +793,20 @@
           <w:sz w:val="22"/>
           <w:szCs w:val="22"/>
         </w:rPr>
-        <w:t>Torrealba, G. et al. (2018), ‘Discovery of two neighbouring satellites in the Carina constellation with MagLiteS’, MNRAS, 475, 5085. https://doi.org/10.1093/mnras/sty170</w:t>
-      </w:r>
+        <w:t xml:space="preserve">Drlica-Wagner, A. et al. (2020), 'Milky Way Satellite Census. I. The Observational Selection Function for Milky Way Satellites in DES Y3 and Pan-STARRS DR1', ApJ, 893, 47. </w:t>
+      </w:r>
+      <w:hyperlink r:id="rId14">
+        <w:r>
+          <w:rPr>
+            <w:rFonts w:ascii="Arial" w:hAnsi="Arial" w:cs="Arial"/>
+            <w:sz w:val="22"/>
+            <w:szCs w:val="22"/>
+            <w:color w:val="0563C1"/>
+            <w:u w:val="single"/>
+          </w:rPr>
+          <w:t>https://doi.org/10.3847/1538-4357/ab7eb9</w:t>
+        </w:r>
+      </w:hyperlink>
     </w:p>
     <w:p>
       <w:pPr>
@@ -769,8 +829,20 @@
           <w:sz w:val="22"/>
           <w:szCs w:val="22"/>
         </w:rPr>
-        <w:t>Torrealba, G., Belokurov, V. &amp; Koposov, S. E. (2019), ‘Nine Tiny Star Clusters in Gaia DR1, PS1 and DES’, MNRAS, 484, 2181. https://doi.org/10.1093/mnras/stz071</w:t>
-      </w:r>
+        <w:t xml:space="preserve">Cerny, W. et al. (2021), 'Eridanus IV: An Ultra-Faint Dwarf Galaxy Candidate Discovered in the DECam Local Volume Exploration Survey', ApJL, 920, L44. </w:t>
+      </w:r>
+      <w:hyperlink r:id="rId15">
+        <w:r>
+          <w:rPr>
+            <w:rFonts w:ascii="Arial" w:hAnsi="Arial" w:cs="Arial"/>
+            <w:sz w:val="22"/>
+            <w:szCs w:val="22"/>
+            <w:color w:val="0563C1"/>
+            <w:u w:val="single"/>
+          </w:rPr>
+          <w:t>https://doi.org/10.3847/2041-8213/ac2d9a</w:t>
+        </w:r>
+      </w:hyperlink>
     </w:p>
     <w:p>
       <w:pPr>
@@ -793,8 +865,20 @@
           <w:sz w:val="22"/>
           <w:szCs w:val="22"/>
         </w:rPr>
-        <w:t>Shipp, N. et al. (2018), ‘Stellar Streams Discovered in the Dark Energy Survey’, ApJ, 862, 114. https://doi.org/10.3847/1538-4357/aacdab</w:t>
-      </w:r>
+        <w:t xml:space="preserve">Cerny, W. et al. (2023), 'Six More Ultra-Faint Milky Way Companions Discovered in the DECam Local Volume Exploration Survey', ApJ, 953, 1. </w:t>
+      </w:r>
+      <w:hyperlink r:id="rId16">
+        <w:r>
+          <w:rPr>
+            <w:rFonts w:ascii="Arial" w:hAnsi="Arial" w:cs="Arial"/>
+            <w:sz w:val="22"/>
+            <w:szCs w:val="22"/>
+            <w:color w:val="0563C1"/>
+            <w:u w:val="single"/>
+          </w:rPr>
+          <w:t>https://doi.org/10.3847/1538-4357/acdd78</w:t>
+        </w:r>
+      </w:hyperlink>
     </w:p>
     <w:p>
       <w:pPr>
@@ -817,8 +901,20 @@
           <w:sz w:val="22"/>
           <w:szCs w:val="22"/>
         </w:rPr>
-        <w:t>Drlica-Wagner, A. et al. (2020), ‘Milky Way Satellite Census. I. The Observational Selection Function for Milky Way Satellites in DES Y3 and Pan-STARRS DR1’, ApJ, 893, 47. https://doi.org/10.3847/1538-4357/ab7eb9</w:t>
-      </w:r>
+        <w:t xml:space="preserve">Shipp, N. et al. (2018), 'Stellar Streams Discovered in the Dark Energy Survey', ApJ, 862, 114. </w:t>
+      </w:r>
+      <w:hyperlink r:id="rId17">
+        <w:r>
+          <w:rPr>
+            <w:rFonts w:ascii="Arial" w:hAnsi="Arial" w:cs="Arial"/>
+            <w:sz w:val="22"/>
+            <w:szCs w:val="22"/>
+            <w:color w:val="0563C1"/>
+            <w:u w:val="single"/>
+          </w:rPr>
+          <w:t>https://doi.org/10.3847/1538-4357/aacdab</w:t>
+        </w:r>
+      </w:hyperlink>
     </w:p>
     <w:p>
       <w:pPr>
@@ -855,8 +951,20 @@
           <w:sz w:val="22"/>
           <w:szCs w:val="22"/>
         </w:rPr>
-        <w:t>Euclid NASA Science Center, ‘Euclid DR1’. https://euclid.caltech.edu/page/euclid-dr1</w:t>
-      </w:r>
+        <w:t xml:space="preserve">ESA, 'Euclid mission timeline and data releases'. </w:t>
+      </w:r>
+      <w:hyperlink r:id="rId18">
+        <w:r>
+          <w:rPr>
+            <w:rFonts w:ascii="Arial" w:hAnsi="Arial" w:cs="Arial"/>
+            <w:sz w:val="22"/>
+            <w:szCs w:val="22"/>
+            <w:color w:val="0563C1"/>
+            <w:u w:val="single"/>
+          </w:rPr>
+          <w:t>https://www.cosmos.esa.int/web/euclid/timeline</w:t>
+        </w:r>
+      </w:hyperlink>
     </w:p>
     <w:p>
       <w:pPr>
@@ -879,8 +987,20 @@
           <w:sz w:val="22"/>
           <w:szCs w:val="22"/>
         </w:rPr>
-        <w:t>Aussel, H. et al. (2026), ‘Euclid Quick Data Release (Q1). I. Data release overview’, A&amp;A. https://doi.org/10.1051/0004-6361/202554610</w:t>
-      </w:r>
+        <w:t xml:space="preserve">Aussel, H. et al. (2026), 'Euclid Quick Data Release (Q1). I. Data release overview', A&amp;A. </w:t>
+      </w:r>
+      <w:hyperlink r:id="rId19">
+        <w:r>
+          <w:rPr>
+            <w:rFonts w:ascii="Arial" w:hAnsi="Arial" w:cs="Arial"/>
+            <w:sz w:val="22"/>
+            <w:szCs w:val="22"/>
+            <w:color w:val="0563C1"/>
+            <w:u w:val="single"/>
+          </w:rPr>
+          <w:t>https://doi.org/10.1051/0004-6361/202554610</w:t>
+        </w:r>
+      </w:hyperlink>
     </w:p>
     <w:p>
       <w:pPr>
@@ -903,8 +1023,20 @@
           <w:sz w:val="22"/>
           <w:szCs w:val="22"/>
         </w:rPr>
-        <w:t>Scaramella, R. et al. (2022), ‘Euclid preparation. I. The Euclid Wide Survey’, A&amp;A, 662, A112. https://doi.org/10.1051/0004-6361/202141938</w:t>
-      </w:r>
+        <w:t xml:space="preserve">Scaramella, R. et al. (2022), 'Euclid preparation. I. The Euclid Wide Survey', A&amp;A, 662, A112. </w:t>
+      </w:r>
+      <w:hyperlink r:id="rId20">
+        <w:r>
+          <w:rPr>
+            <w:rFonts w:ascii="Arial" w:hAnsi="Arial" w:cs="Arial"/>
+            <w:sz w:val="22"/>
+            <w:szCs w:val="22"/>
+            <w:color w:val="0563C1"/>
+            <w:u w:val="single"/>
+          </w:rPr>
+          <w:t>https://doi.org/10.1051/0004-6361/202141938</w:t>
+        </w:r>
+      </w:hyperlink>
     </w:p>
     <w:sectPr>
       <w:pgSz w:w="11906" w:h="16838"/>

</xml_diff>

<commit_message>
Add second supervisor and UTO to all projects
</commit_message>
<xml_diff>
--- a/01_Euclid_DR1_Dwarf_Satellites_and_Streams.docx
+++ b/01_Euclid_DR1_Dwarf_Satellites_and_Streams.docx
@@ -43,6 +43,32 @@
           <w:szCs w:val="22"/>
         </w:rPr>
       </w:pPr>
+      <w:r>
+        <w:rPr>
+          <w:rFonts w:ascii="Arial" w:hAnsi="Arial" w:cs="Arial"/>
+          <w:sz w:val="22"/>
+          <w:szCs w:val="22"/>
+        </w:rPr>
+        <w:t>Supervisor II: Professor Sergey Koposov (skoposov@ed.ac.uk)</w:t>
+      </w:r>
+    </w:p>
+    <w:p>
+      <w:pPr>
+        <w:spacing w:before="40" w:after="0" w:line="360" w:lineRule="auto"/>
+        <w:rPr>
+          <w:rFonts w:ascii="Arial" w:hAnsi="Arial" w:cs="Arial"/>
+          <w:sz w:val="22"/>
+          <w:szCs w:val="22"/>
+        </w:rPr>
+      </w:pPr>
+      <w:r>
+        <w:rPr>
+          <w:rFonts w:ascii="Arial" w:hAnsi="Arial" w:cs="Arial"/>
+          <w:sz w:val="22"/>
+          <w:szCs w:val="22"/>
+        </w:rPr>
+        <w:t>UTO: Professor Vasily Belokurov (vasily@ast.cam.ac.uk)</w:t>
+      </w:r>
     </w:p>
     <w:p>
       <w:pPr>

</xml_diff>

<commit_message>
Prose pass on projects 1-4; add "Discovering" to all titles; fix refs
- Strunk & White prose pass (Summary, Background, deliverables) across
  projects 01-04 for a consistent, active voice matching project 05
- Titles: project 03 gains "Discovering"; all five now say Discovering
- Project 02: correct Marchetti et al. 2022 title (DR3, not DR2 paper);
  exact Copin Q1/SIR title + volume
- Project 01: complete the Aussel Q1 citation (A&A 711, A1)
- README: show full project titles in the table

Co-Authored-By: Claude Opus 4.8 <noreply@anthropic.com>
</commit_message>
<xml_diff>
--- a/01_Euclid_DR1_Dwarf_Satellites_and_Streams.docx
+++ b/01_Euclid_DR1_Dwarf_Satellites_and_Streams.docx
@@ -94,30 +94,20 @@
         </w:rPr>
       </w:pPr>
       <w:r>
-        <w:rPr>
-          <w:rFonts w:ascii="Arial" w:hAnsi="Arial" w:cs="Arial"/>
-          <w:sz w:val="22"/>
-          <w:szCs w:val="22"/>
-        </w:rPr>
-        <w:t>The faintest companions of the Milky Way are invisible in integrated light. They appear only as sparse groups of resolved stars that trace an old, metal-poor population. Ultra-faint dwarf galaxies (UFDs) inhabit the smallest dark-matter haloes known to host stars, so their census tests low-mass galaxy formation, reionisation, and the small-scale behaviour of dark matter. That census remains incomplete, especially for distant or diffuse systems.</w:t>
-      </w:r>
-    </w:p>
-    <w:p>
-      <w:pPr>
-        <w:spacing w:before="40" w:after="0" w:line="360" w:lineRule="auto"/>
-        <w:rPr>
-          <w:rFonts w:ascii="Arial" w:hAnsi="Arial" w:cs="Arial"/>
-          <w:sz w:val="22"/>
-          <w:szCs w:val="22"/>
-        </w:rPr>
-      </w:pPr>
-      <w:r>
-        <w:rPr>
-          <w:rFonts w:ascii="Arial" w:hAnsi="Arial" w:cs="Arial"/>
-          <w:sz w:val="22"/>
-          <w:szCs w:val="22"/>
-        </w:rPr>
-        <w:t>Euclid DR1 will combine deep photometry, sharp imaging, and wide sky coverage. The student's main aim is to discover and characterise new UFD candidates. Old, metal-poor isochrones placed at a range of distances will select possible members; a difference-of-Gaussians filter will then reveal spatial overdensities. Every credible peak will be ranked using its colour-magnitude diagram, spatial concentration, stability under changes to the selection, Gaia astrometry for brighter stars, and checks for galaxy clustering or imaging artefacts. Known systems and injected mock satellites will measure the search sensitivity. The strongest candidates will receive initial estimates of distance, luminosity, size, ellipticity, and membership. Stellar streams provide a secondary extension.</w:t>
+        <w:t>The faintest companions of the Milky Way shine too dimly to see in integrated light. They betray themselves only as sparse scatterings of resolved stars, old and metal-poor. These ultra-faint dwarf galaxies (UFDs) occupy the smallest dark-matter haloes known to hold stars, so counting them tests low-mass galaxy formation, reionisation, and the behaviour of dark matter on small scales. That count is still far from complete, above all for the most distant and diffuse systems.</w:t>
+      </w:r>
+    </w:p>
+    <w:p>
+      <w:pPr>
+        <w:spacing w:before="40" w:after="0" w:line="360" w:lineRule="auto"/>
+        <w:rPr>
+          <w:rFonts w:ascii="Arial" w:hAnsi="Arial" w:cs="Arial"/>
+          <w:sz w:val="22"/>
+          <w:szCs w:val="22"/>
+        </w:rPr>
+      </w:pPr>
+      <w:r>
+        <w:t>Euclid DR1 brings together deep photometry, sharp imaging, and wide sky coverage. The student will use it to discover and characterise new UFD candidates. Old, metal-poor isochrones, stepped through a range of distances, select possible member stars; a difference-of-Gaussians filter then picks out compact spatial overdensities. The student ranks each credible peak on its colour-magnitude diagram, its spatial concentration, its stability as the selection changes, Gaia astrometry for the brighter stars, and checks for galaxy clustering and imaging artefacts. Known satellites and injected mocks measure how sensitive the search is. For the strongest candidates, the student then estimates distance, luminosity, size, ellipticity, and membership. Stellar streams offer a secondary extension.</w:t>
       </w:r>
     </w:p>
     <w:p>
@@ -144,48 +134,33 @@
         </w:rPr>
       </w:pPr>
       <w:r>
-        <w:rPr>
-          <w:rFonts w:ascii="Arial" w:hAnsi="Arial" w:cs="Arial"/>
-          <w:sz w:val="22"/>
-          <w:szCs w:val="22"/>
-        </w:rPr>
-        <w:t>UFDs extend the galaxy population to its lowest luminosities. Their ancient stellar populations and large inferred mass-to-light ratios make them sensitive probes of star formation in low-mass dark-matter haloes. A more complete census can test how reionisation suppressed early galaxies and whether the abundance of small haloes agrees with dark-matter models. Yet a UFD may contribute only a few detectable stars above a foreground of Milky Way stars and compact background galaxies. A plausible overdensity may instead be a star cluster, a chance alignment, or a survey artefact. The search must therefore identify weak signals without forcing every detection into a physical class. Spectroscopy may ultimately be needed to distinguish a dark-matter-dominated dwarf from an ultra-faint star cluster.</w:t>
-      </w:r>
-    </w:p>
-    <w:p>
-      <w:pPr>
-        <w:spacing w:before="40" w:after="0" w:line="360" w:lineRule="auto"/>
-        <w:rPr>
-          <w:rFonts w:ascii="Arial" w:hAnsi="Arial" w:cs="Arial"/>
-          <w:sz w:val="22"/>
-          <w:szCs w:val="22"/>
-        </w:rPr>
-      </w:pPr>
-      <w:r>
-        <w:rPr>
-          <w:rFonts w:ascii="Arial" w:hAnsi="Arial" w:cs="Arial"/>
-          <w:sz w:val="22"/>
-          <w:szCs w:val="22"/>
-        </w:rPr>
-        <w:t>Resolved-star surveys turned this problem into a repeatable experiment. Koposov et al. (2008, 2015) used colour-magnitude selections and spatial filtering to uncover systems missed in integrated light, while Torrealba et al. (2016a, 2016b) extended the method across a broad range of sizes and surface brightnesses. Drlica-Wagner et al. (2020) used injected systems to measure the selection function of a survey-scale census. Cerny et al. (2021, 2023) combined matched-filter searches with structural modelling and Gaia proper motions, while retaining the dwarf-cluster ambiguity when the evidence remained inconclusive.</w:t>
-      </w:r>
-    </w:p>
-    <w:p>
-      <w:pPr>
-        <w:spacing w:before="40" w:after="0" w:line="360" w:lineRule="auto"/>
-        <w:rPr>
-          <w:rFonts w:ascii="Arial" w:hAnsi="Arial" w:cs="Arial"/>
-          <w:sz w:val="22"/>
-          <w:szCs w:val="22"/>
-        </w:rPr>
-      </w:pPr>
-      <w:r>
-        <w:rPr>
-          <w:rFonts w:ascii="Arial" w:hAnsi="Arial" w:cs="Arial"/>
-          <w:sz w:val="22"/>
-          <w:szCs w:val="22"/>
-        </w:rPr>
-        <w:t>Euclid changes the reach of this experiment. Its sharp VIS images help separate stars from barely resolved galaxies, while its optical and near-infrared photometry reaches far fainter than Gaia over a wide area. Euclid DR1 will therefore drive the discovery search; shallower external imaging will neither set its depth nor be required across the footprint. Gaia will enter only for bright possible members. This choice makes variable depth, bright-star masks, catalogue artefacts, and residual galaxy contamination essential controls. A transparent search whose assumptions can be tested field by field is more useful here than a highly tuned algorithm.</w:t>
+        <w:t>UFDs push the galaxy population to its faintest limit. Their ancient stars and large mass-to-light ratios make them sharp probes of star formation in low-mass dark-matter haloes, and a fuller census tests how reionisation suppressed early galaxies and whether small haloes are as abundant as dark-matter models predict. But a UFD may raise only a handful of detectable stars above the foreground of Milky Way stars and compact background galaxies, and a promising overdensity may turn out to be a star cluster, a chance alignment, or a survey artefact. The search must therefore catch a weak signal without forcing every detection into a class. Telling a dark-matter-dominated dwarf from an ultra-faint star cluster may in the end require spectroscopy.</w:t>
+      </w:r>
+    </w:p>
+    <w:p>
+      <w:pPr>
+        <w:spacing w:before="40" w:after="0" w:line="360" w:lineRule="auto"/>
+        <w:rPr>
+          <w:rFonts w:ascii="Arial" w:hAnsi="Arial" w:cs="Arial"/>
+          <w:sz w:val="22"/>
+          <w:szCs w:val="22"/>
+        </w:rPr>
+      </w:pPr>
+      <w:r>
+        <w:t>Resolved-star surveys made this a repeatable experiment. Koposov et al. (2008, 2015) uncovered systems missed in integrated light through colour-magnitude selection and spatial filtering; Torrealba et al. (2016a, 2016b) stretched the method across a wide range of sizes and surface brightnesses. Drlica-Wagner et al. (2020) injected mock systems to measure the selection function of a survey-scale census. Cerny et al. (2021, 2023) joined matched-filter searches to structural modelling and Gaia proper motions, and left the dwarf-cluster question open whenever the evidence fell short.</w:t>
+      </w:r>
+    </w:p>
+    <w:p>
+      <w:pPr>
+        <w:spacing w:before="40" w:after="0" w:line="360" w:lineRule="auto"/>
+        <w:rPr>
+          <w:rFonts w:ascii="Arial" w:hAnsi="Arial" w:cs="Arial"/>
+          <w:sz w:val="22"/>
+          <w:szCs w:val="22"/>
+        </w:rPr>
+      </w:pPr>
+      <w:r>
+        <w:t>Euclid extends the experiment's reach. Its sharp VIS images help separate stars from barely resolved galaxies, and its optical and near-infrared photometry reaches far fainter than Gaia across a wide area. Euclid DR1 therefore drives the search: shallower external imaging neither sets its depth nor covers its footprint, and Gaia enters only for the bright candidate members. That choice turns variable depth, bright-star masks, catalogue artefacts, and residual galaxy contamination into the controls that matter. Here a transparent search, testable field by field, serves better than a finely tuned algorithm.</w:t>
       </w:r>
     </w:p>
     <w:p>
@@ -212,12 +187,7 @@
         </w:rPr>
       </w:pPr>
       <w:r>
-        <w:rPr>
-          <w:rFonts w:ascii="Arial" w:hAnsi="Arial" w:cs="Arial"/>
-          <w:sz w:val="22"/>
-          <w:szCs w:val="22"/>
-        </w:rPr>
-        <w:t>The student will build a simple pipeline, validate it on known and artificial systems, and then search the Euclid DR1 footprint:</w:t>
+        <w:t>The student builds a simple pipeline, validates it on known and artificial systems, and then searches the Euclid DR1 footprint:</w:t>
       </w:r>
     </w:p>
     <w:p>
@@ -434,12 +404,7 @@
         </w:rPr>
       </w:pPr>
       <w:r>
-        <w:rPr>
-          <w:rFonts w:ascii="Arial" w:hAnsi="Arial" w:cs="Arial"/>
-          <w:sz w:val="22"/>
-          <w:szCs w:val="22"/>
-        </w:rPr>
-        <w:t>The main deliverable will be a ranked catalogue of all credible UFD candidates, initial measurements for the strongest systems, and a quantified search sensitivity across the usable Euclid DR1 footprint.</w:t>
+        <w:t>The main deliverable is a ranked catalogue of every credible UFD candidate, first measurements for the strongest systems, and a quantified search sensitivity across the usable Euclid DR1 footprint.</w:t>
       </w:r>
     </w:p>
     <w:p>
@@ -1008,12 +973,7 @@
         </w:rPr>
       </w:pPr>
       <w:r>
-        <w:rPr>
-          <w:rFonts w:ascii="Arial" w:hAnsi="Arial" w:cs="Arial"/>
-          <w:sz w:val="22"/>
-          <w:szCs w:val="22"/>
-        </w:rPr>
-        <w:t xml:space="preserve">Aussel, H. et al. (2026), 'Euclid Quick Data Release (Q1). I. Data release overview', A&amp;A. </w:t>
+        <w:t xml:space="preserve">Aussel, H. et al. (2026), ‘Euclid Quick Data Release (Q1). I. Data release overview’, A&amp;A, 711, A1. </w:t>
       </w:r>
       <w:hyperlink r:id="rId19">
         <w:r>

</xml_diff>

<commit_message>
Address Koposov comments on projects 1-4
- P1 (UFDs): refocus the first step on efficient star-galaxy separation
  and the magnitude limit within the Euclid Wide Survey; defer masks/depth/
  contamination mapping to where validation shows it is needed
- P2 (HVS): state Euclid's advantages (spectroscopic completeness vs
  target-selected surveys, depth to H~22.5); cite current RV precision
  ~150 km/s (Euclid Collaboration 2026, Q1.VII) and the Gaia BP/RP RV
  approach (Viswanathan et al. 2024); use the released Q1 stellar RV table
  and its Gaia comparison in calibration
- P3 (Magellanic): add item to trace the MC halo to its detectable edge
  and test for tidal truncation by the Milky Way
- P4 (minute-timescale): add KBO/Oort-cloud stellar occultations as a
  single-CCD special case (Ofek, Spitzer & Nir 2024)

Co-Authored-By: Claude Opus 4.8 <noreply@anthropic.com>
</commit_message>
<xml_diff>
--- a/01_Euclid_DR1_Dwarf_Satellites_and_Streams.docx
+++ b/01_Euclid_DR1_Dwarf_Satellites_and_Streams.docx
@@ -207,21 +207,12 @@
       </w:pPr>
       <w:r>
         <w:rPr>
-          <w:rFonts w:ascii="Arial" w:hAnsi="Arial" w:cs="Arial"/>
-          <w:sz w:val="22"/>
-          <w:szCs w:val="22"/>
           <w:b/>
-          <w:bCs/>
-        </w:rPr>
-        <w:t>Prepare the Euclid DR1 sample.</w:t>
-      </w:r>
-      <w:r>
-        <w:rPr>
-          <w:rFonts w:ascii="Arial" w:hAnsi="Arial" w:cs="Arial"/>
-          <w:sz w:val="22"/>
-          <w:szCs w:val="22"/>
-        </w:rPr>
-        <w:t xml:space="preserve"> Use release masks and depth information to define a well-behaved footprint and a conservative point-source sample. Measure how completeness and unresolved-galaxy contamination vary across the footprint. Begin with simple catalogue cuts and refine them only when validation tests reveal a clear need.</w:t>
+        </w:rPr>
+        <w:t xml:space="preserve">Define the point-source sample in the Euclid Wide Survey. </w:t>
+      </w:r>
+      <w:r>
+        <w:t>Concentrate first on efficient star–galaxy separation and on the magnitude down to which it still works: use Euclid's VIS morphology and optical–near-infrared colours to keep point sources and reject unresolved galaxies, and find the depth within the Wide Survey where the separation stays clean enough for a satellite search. Simple catalogue cuts come first; masks, depth variation, and residual contamination enter later, only where a validation test shows the search needs them.</w:t>
       </w:r>
     </w:p>
     <w:p>

</xml_diff>

<commit_message>
Add figures/ and embed a Figure 1 in every project description
- figures/ holds curated illustration figures (embedded + candidates) with
  CREDITS.md documenting source, licence, and fit for each
- Embed one Figure 1 per project, each referenced in the main text, captioned,
  and credited (sources already in each reference list):
  - P1 UFDs: Bootes V discovery panel (Cerny et al. 2023)
  - P2 HVS: side-by-side S5-HVS1 sky trajectory + Euclid NISP grism
    (Koposov/S5; ESA/Euclid)
  - P3 Magellanic: panoramic LMC/SMC periphery star-count map (Mackey et al. 2018)
  - P4 variability: Gaia focal plane / AF1-AF9 transit (Prusti et al. 2016)
  - P5 inner halo: clumps in H_J-[Fe/H] (Dillamore & Sanders 2025)

Paper figures reproduced with citation for internal use; ESA imagery under
CC BY-SA 3.0 IGO.

Co-Authored-By: Claude Opus 4.8 <noreply@anthropic.com>
</commit_message>
<xml_diff>
--- a/01_Euclid_DR1_Dwarf_Satellites_and_Streams.docx
+++ b/01_Euclid_DR1_Dwarf_Satellites_and_Streams.docx
@@ -147,7 +147,7 @@
         </w:rPr>
       </w:pPr>
       <w:r>
-        <w:t>Resolved-star surveys made this a repeatable experiment. Koposov et al. (2008, 2015) uncovered systems missed in integrated light through colour-magnitude selection and spatial filtering; Torrealba et al. (2016a, 2016b) stretched the method across a wide range of sizes and surface brightnesses. Drlica-Wagner et al. (2020) injected mock systems to measure the selection function of a survey-scale census. Cerny et al. (2021, 2023) joined matched-filter searches to structural modelling and Gaia proper motions, and left the dwarf-cluster question open whenever the evidence fell short.</w:t>
+        <w:t>Resolved-star surveys made this a repeatable experiment. Koposov et al. (2008, 2015) uncovered systems missed in integrated light through colour-magnitude selection and spatial filtering; Torrealba et al. (2016a, 2016b) stretched the method across a wide range of sizes and surface brightnesses. Drlica-Wagner et al. (2020) injected mock systems to measure the selection function of a survey-scale census. Cerny et al. (2021, 2023) joined matched-filter searches to structural modelling and Gaia proper motions, and left the dwarf-cluster question open whenever the evidence fell short (Figure 1).</w:t>
       </w:r>
     </w:p>
     <w:p>
@@ -1065,6 +1065,63 @@
           <w:t>https://doi.org/10.1051/0004-6361/202141938</w:t>
         </w:r>
       </w:hyperlink>
+    </w:p>
+    <w:p>
+      <w:pPr>
+        <w:jc w:val="center"/>
+      </w:pPr>
+      <w:r>
+        <w:drawing>
+          <wp:inline xmlns:a="http://schemas.openxmlformats.org/drawingml/2006/main" xmlns:pic="http://schemas.openxmlformats.org/drawingml/2006/picture">
+            <wp:extent cx="5760720" cy="3828478"/>
+            <wp:docPr id="1" name="Picture 1"/>
+            <wp:cNvGraphicFramePr>
+              <a:graphicFrameLocks noChangeAspect="1"/>
+            </wp:cNvGraphicFramePr>
+            <a:graphic>
+              <a:graphicData uri="http://schemas.openxmlformats.org/drawingml/2006/picture">
+                <pic:pic>
+                  <pic:nvPicPr>
+                    <pic:cNvPr id="0" name="01_cerny2023_bootesV_discovery.png"/>
+                    <pic:cNvPicPr/>
+                  </pic:nvPicPr>
+                  <pic:blipFill>
+                    <a:blip r:embed="rId21"/>
+                    <a:stretch>
+                      <a:fillRect/>
+                    </a:stretch>
+                  </pic:blipFill>
+                  <pic:spPr>
+                    <a:xfrm>
+                      <a:off x="0" y="0"/>
+                      <a:ext cx="5760720" cy="3828478"/>
+                    </a:xfrm>
+                    <a:prstGeom prst="rect"/>
+                  </pic:spPr>
+                </pic:pic>
+              </a:graphicData>
+            </a:graphic>
+          </wp:inline>
+        </w:drawing>
+      </w:r>
+    </w:p>
+    <w:p>
+      <w:pPr>
+        <w:jc w:val="center"/>
+      </w:pPr>
+      <w:r>
+        <w:rPr>
+          <w:b/>
+          <w:sz w:val="18"/>
+        </w:rPr>
+        <w:t xml:space="preserve">Figure 1. </w:t>
+      </w:r>
+      <w:r>
+        <w:rPr>
+          <w:sz w:val="18"/>
+        </w:rPr>
+        <w:t>How an ultra-faint satellite appears in resolved-star data, and how it is vetted — here Boötes V from the DELVE survey. Top: the spatial overdensity of isochrone-selected stars (left, centre) and its radial density profile against the background field (right). Bottom: colour–magnitude diagrams of the candidate's inner region, its selected members, and a background field, with an old, metal-poor isochrone (orange). The Euclid search in this project is the same experiment — isochrone selection, spatial overdensity, and CMD verification — carried to fainter and more distant systems. From Cerny et al. (2023).</w:t>
+      </w:r>
     </w:p>
     <w:sectPr>
       <w:pgSz w:w="11906" w:h="16838"/>

</xml_diff>